<commit_message>
Update protocol upgrade design according to review comments
git-svn-id: http://192.168.20.11/sequoiadb/trunk@38953 6121f079-4a18-41d3-8c30-8870a322f2c2
</commit_message>
<xml_diff>
--- a/internal_doc/03.开发设计/Story-通信协议升级.docx
+++ b/internal_doc/03.开发设计/Story-通信协议升级.docx
@@ -107,7 +107,19 @@
           <w:p>
             <w:pPr>
               <w:ind w:left="0"/>
-            </w:pPr>
+              <w:rPr>
+                <w:rFonts w:hint="eastAsia"/>
+              </w:rPr>
+            </w:pPr>
+            <w:r>
+              <w:t xml:space="preserve">2019-01-15  </w:t>
+            </w:r>
+            <w:r>
+              <w:rPr>
+                <w:rFonts w:hint="eastAsia"/>
+              </w:rPr>
+              <w:t>杨上德</w:t>
+            </w:r>
           </w:p>
         </w:tc>
         <w:tc>
@@ -118,6 +130,9 @@
             <w:pPr>
               <w:ind w:left="0"/>
             </w:pPr>
+            <w:r>
+              <w:t>Update according to review comments</w:t>
+            </w:r>
           </w:p>
         </w:tc>
       </w:tr>
@@ -257,215 +272,47 @@
     </w:p>
     <w:p>
       <w:pPr>
-        <w:pStyle w:val="aa"/>
-        <w:numPr>
-          <w:ilvl w:val="0"/>
-          <w:numId w:val="12"/>
-        </w:numPr>
-        <w:ind w:firstLineChars="0"/>
-      </w:pPr>
-      <w:r>
-        <w:rPr>
-          <w:rFonts w:hint="eastAsia"/>
-        </w:rPr>
-        <w:t>新增通用控制标识</w:t>
-      </w:r>
-      <w:r>
-        <w:rPr>
-          <w:rFonts w:hint="eastAsia"/>
-        </w:rPr>
-        <w:t>，说见第五部分的</w:t>
-      </w:r>
-      <w:r>
-        <w:rPr>
-          <w:rFonts w:hint="eastAsia"/>
-        </w:rPr>
-        <w:t xml:space="preserve"> flag </w:t>
-      </w:r>
-      <w:r>
-        <w:rPr>
-          <w:rFonts w:hint="eastAsia"/>
-        </w:rPr>
-        <w:t>列表</w:t>
+        <w:ind w:left="777"/>
+      </w:pPr>
+      <w:r>
+        <w:rPr>
+          <w:rFonts w:hint="eastAsia"/>
+        </w:rPr>
+        <w:t>本</w:t>
+      </w:r>
+      <w:r>
+        <w:rPr>
+          <w:rFonts w:hint="eastAsia"/>
+        </w:rPr>
+        <w:t xml:space="preserve"> story </w:t>
+      </w:r>
+      <w:r>
+        <w:rPr>
+          <w:rFonts w:hint="eastAsia"/>
+        </w:rPr>
+        <w:t>无新增对外接口。</w:t>
       </w:r>
     </w:p>
     <w:p>
       <w:pPr>
-        <w:pStyle w:val="aa"/>
-        <w:numPr>
-          <w:ilvl w:val="0"/>
-          <w:numId w:val="12"/>
-        </w:numPr>
-        <w:ind w:firstLineChars="0"/>
-      </w:pPr>
-      <w:r>
-        <w:rPr>
-          <w:rFonts w:hint="eastAsia"/>
-        </w:rPr>
-        <w:t>新增设置、清除</w:t>
-      </w:r>
-      <w:r>
-        <w:rPr>
-          <w:rFonts w:hint="eastAsia"/>
-        </w:rPr>
-        <w:t>通用控制标识</w:t>
-      </w:r>
-      <w:r>
-        <w:rPr>
-          <w:rFonts w:hint="eastAsia"/>
-        </w:rPr>
-        <w:t>的接口（在各驱动及</w:t>
-      </w:r>
-      <w:r>
-        <w:rPr>
-          <w:rFonts w:hint="eastAsia"/>
-        </w:rPr>
-        <w:t xml:space="preserve">sdb </w:t>
-      </w:r>
-      <w:r>
-        <w:rPr>
-          <w:rFonts w:hint="eastAsia"/>
-        </w:rPr>
-        <w:t>中均提供</w:t>
-      </w:r>
-      <w:r>
-        <w:rPr>
-          <w:rFonts w:hint="eastAsia"/>
-        </w:rPr>
-        <w:t>）</w:t>
-      </w:r>
-      <w:r>
-        <w:rPr>
-          <w:rFonts w:hint="eastAsia"/>
-        </w:rPr>
-        <w:t>，在连接上进行设置和清除，</w:t>
-      </w:r>
-      <w:r>
-        <w:rPr>
-          <w:rFonts w:hint="eastAsia"/>
-        </w:rPr>
-        <w:t>如</w:t>
-      </w:r>
-      <w:r>
-        <w:t>C</w:t>
-      </w:r>
-      <w:r>
-        <w:rPr>
-          <w:rFonts w:hint="eastAsia"/>
-        </w:rPr>
-        <w:t>驱动</w:t>
-      </w:r>
-      <w:r>
-        <w:t>:</w:t>
+        <w:pStyle w:val="2"/>
+      </w:pPr>
+      <w:r>
+        <w:rPr>
+          <w:rFonts w:hint="eastAsia"/>
+        </w:rPr>
+        <w:t>Story</w:t>
+      </w:r>
+      <w:r>
+        <w:rPr>
+          <w:rFonts w:hint="eastAsia"/>
+        </w:rPr>
+        <w:t>约束和依赖</w:t>
       </w:r>
     </w:p>
     <w:p>
       <w:pPr>
-        <w:pStyle w:val="aa"/>
-        <w:ind w:left="717" w:firstLineChars="0" w:firstLine="0"/>
-      </w:pPr>
-      <w:r>
-        <w:t>void setCtrl</w:t>
-      </w:r>
-      <w:r>
-        <w:t>Flags( INT32 flags ) ;</w:t>
-      </w:r>
-    </w:p>
-    <w:p>
-      <w:pPr>
-        <w:pStyle w:val="aa"/>
-        <w:ind w:left="717" w:firstLineChars="0" w:firstLine="0"/>
-      </w:pPr>
-      <w:r>
-        <w:t>void clearCtrl</w:t>
-      </w:r>
-      <w:r>
-        <w:t>Flags() ;</w:t>
-      </w:r>
-    </w:p>
-    <w:p>
-      <w:pPr>
-        <w:pStyle w:val="aa"/>
-        <w:ind w:left="717" w:firstLineChars="0" w:firstLine="0"/>
-      </w:pPr>
-      <w:r>
-        <w:rPr>
-          <w:rFonts w:hint="eastAsia"/>
-        </w:rPr>
-        <w:t>当设置完</w:t>
-      </w:r>
-      <w:r>
-        <w:rPr>
-          <w:rFonts w:hint="eastAsia"/>
-        </w:rPr>
-        <w:t xml:space="preserve"> flags </w:t>
-      </w:r>
-      <w:r>
-        <w:rPr>
-          <w:rFonts w:hint="eastAsia"/>
-        </w:rPr>
-        <w:t>后，在清除之前，该连接上的所有操作都受该</w:t>
-      </w:r>
-      <w:r>
-        <w:rPr>
-          <w:rFonts w:hint="eastAsia"/>
-        </w:rPr>
-        <w:t xml:space="preserve"> flags </w:t>
-      </w:r>
-      <w:r>
-        <w:rPr>
-          <w:rFonts w:hint="eastAsia"/>
-        </w:rPr>
-        <w:t>的影响。</w:t>
-      </w:r>
-      <w:r>
-        <w:rPr>
-          <w:rFonts w:hint="eastAsia"/>
-        </w:rPr>
-        <w:t>通过单独提供接口设置</w:t>
-      </w:r>
-      <w:r>
-        <w:rPr>
-          <w:rFonts w:hint="eastAsia"/>
-        </w:rPr>
-        <w:t xml:space="preserve"> flags</w:t>
-      </w:r>
-      <w:r>
-        <w:rPr>
-          <w:rFonts w:hint="eastAsia"/>
-        </w:rPr>
-        <w:t>，</w:t>
-      </w:r>
-      <w:r>
-        <w:rPr>
-          <w:rFonts w:hint="eastAsia"/>
-        </w:rPr>
-        <w:t>以避免修改大量接口。</w:t>
-      </w:r>
-    </w:p>
-    <w:p>
-      <w:pPr>
-        <w:pStyle w:val="2"/>
-      </w:pPr>
-      <w:r>
-        <w:rPr>
-          <w:rFonts w:hint="eastAsia"/>
-        </w:rPr>
-        <w:t>Story</w:t>
-      </w:r>
-      <w:r>
-        <w:rPr>
-          <w:rFonts w:hint="eastAsia"/>
-        </w:rPr>
-        <w:t>约束和依赖</w:t>
-      </w:r>
-    </w:p>
-    <w:p>
-      <w:pPr>
         <w:ind w:left="777"/>
-        <w:rPr>
-          <w:rFonts w:hint="eastAsia"/>
-        </w:rPr>
       </w:pPr>
       <w:r>
         <w:rPr>
@@ -540,7 +387,6 @@
         <w:rPr>
           <w:rFonts w:hint="eastAsia"/>
         </w:rPr>
-        <w:lastRenderedPageBreak/>
         <w:t>通用消息头</w:t>
       </w:r>
       <w:r>
@@ -573,7 +419,19 @@
         <w:rPr>
           <w:rFonts w:hint="eastAsia"/>
         </w:rPr>
-        <w:t>对通用消息头进行扩展，支持通用消息标识、版本号。</w:t>
+        <w:t>对通用消息头进行扩展，支持通用消息标识、版本号</w:t>
+      </w:r>
+      <w:r>
+        <w:rPr>
+          <w:rFonts w:hint="eastAsia"/>
+        </w:rPr>
+        <w:t>等</w:t>
+      </w:r>
+      <w:r>
+        <w:rPr>
+          <w:rFonts w:hint="eastAsia"/>
+        </w:rPr>
+        <w:t>。</w:t>
       </w:r>
       <w:r>
         <w:rPr>
@@ -585,7 +443,13 @@
         <w:rPr>
           <w:rFonts w:hint="eastAsia"/>
         </w:rPr>
-        <w:t>续如果消息还要变更，可在消息头中得到</w:t>
+        <w:t>续如果消息还要进行升级</w:t>
+      </w:r>
+      <w:r>
+        <w:rPr>
+          <w:rFonts w:hint="eastAsia"/>
+        </w:rPr>
+        <w:t>，可在消息头中得到</w:t>
       </w:r>
       <w:r>
         <w:rPr>
@@ -604,12 +468,15 @@
       <w:r>
         <w:rPr>
           <w:noProof/>
-        </w:rPr>
+          <w:sz w:val="16"/>
+          <w:szCs w:val="16"/>
+        </w:rPr>
+        <w:lastRenderedPageBreak/>
         <w:drawing>
-          <wp:inline distT="0" distB="0" distL="0" distR="0" wp14:anchorId="693124E6" wp14:editId="15675734">
-            <wp:extent cx="5274310" cy="852170"/>
+          <wp:inline distT="0" distB="0" distL="0" distR="0" wp14:anchorId="5C6FA749" wp14:editId="11CA5BB4">
+            <wp:extent cx="5274310" cy="1345565"/>
             <wp:effectExtent l="0" t="0" r="0" b="0"/>
-            <wp:docPr id="2" name="图片 2"/>
+            <wp:docPr id="3" name="图片 3"/>
             <wp:cNvGraphicFramePr>
               <a:graphicFrameLocks xmlns:a="http://schemas.openxmlformats.org/drawingml/2006/main" noChangeAspect="1"/>
             </wp:cNvGraphicFramePr>
@@ -617,362 +484,7 @@
               <a:graphicData uri="http://schemas.openxmlformats.org/drawingml/2006/picture">
                 <pic:pic xmlns:pic="http://schemas.openxmlformats.org/drawingml/2006/picture">
                   <pic:nvPicPr>
-                    <pic:cNvPr id="2" name="msg-header-upgrade.png"/>
-                    <pic:cNvPicPr/>
-                  </pic:nvPicPr>
-                  <pic:blipFill>
-                    <a:blip r:embed="rId7">
-                      <a:extLst>
-                        <a:ext uri="{28A0092B-C50C-407E-A947-70E740481C1C}">
-                          <a14:useLocalDpi xmlns:a14="http://schemas.microsoft.com/office/drawing/2010/main" val="0"/>
-                        </a:ext>
-                      </a:extLst>
-                    </a:blip>
-                    <a:stretch>
-                      <a:fillRect/>
-                    </a:stretch>
-                  </pic:blipFill>
-                  <pic:spPr>
-                    <a:xfrm>
-                      <a:off x="0" y="0"/>
-                      <a:ext cx="5274310" cy="852170"/>
-                    </a:xfrm>
-                    <a:prstGeom prst="rect">
-                      <a:avLst/>
-                    </a:prstGeom>
-                  </pic:spPr>
-                </pic:pic>
-              </a:graphicData>
-            </a:graphic>
-          </wp:inline>
-        </w:drawing>
-      </w:r>
-    </w:p>
-    <w:p>
-      <w:pPr>
-        <w:pStyle w:val="4"/>
-      </w:pPr>
-      <w:r>
-        <w:t>v</w:t>
-      </w:r>
-      <w:r>
-        <w:rPr>
-          <w:rFonts w:hint="eastAsia"/>
-        </w:rPr>
-        <w:t>ersion</w:t>
-      </w:r>
-    </w:p>
-    <w:p>
-      <w:pPr>
-        <w:ind w:left="0"/>
-      </w:pPr>
-      <w:r>
-        <w:tab/>
-      </w:r>
-      <w:r>
-        <w:rPr>
-          <w:rFonts w:hint="eastAsia"/>
-        </w:rPr>
-        <w:t>协议版本号，分基础版本号与复合版本号。基础版本号使用从１开始的序列值，老版本定义为</w:t>
-      </w:r>
-      <w:r>
-        <w:rPr>
-          <w:rFonts w:hint="eastAsia"/>
-        </w:rPr>
-        <w:t>1</w:t>
-      </w:r>
-      <w:r>
-        <w:rPr>
-          <w:rFonts w:hint="eastAsia"/>
-        </w:rPr>
-        <w:t>，当前开发的版本定义为</w:t>
-      </w:r>
-      <w:r>
-        <w:rPr>
-          <w:rFonts w:hint="eastAsia"/>
-        </w:rPr>
-        <w:t>2</w:t>
-      </w:r>
-      <w:r>
-        <w:rPr>
-          <w:rFonts w:hint="eastAsia"/>
-        </w:rPr>
-        <w:t>，使用该整形值的低</w:t>
-      </w:r>
-      <w:r>
-        <w:rPr>
-          <w:rFonts w:hint="eastAsia"/>
-        </w:rPr>
-        <w:t xml:space="preserve"> 16 </w:t>
-      </w:r>
-      <w:r>
-        <w:rPr>
-          <w:rFonts w:hint="eastAsia"/>
-        </w:rPr>
-        <w:t>位表示。使用复合版本</w:t>
-      </w:r>
-      <w:r>
-        <w:rPr>
-          <w:rFonts w:hint="eastAsia"/>
-        </w:rPr>
-        <w:t>号的目的是为了解决与老版本的协议兼容问题</w:t>
-      </w:r>
-      <w:r>
-        <w:rPr>
-          <w:rFonts w:hint="eastAsia"/>
-        </w:rPr>
-        <w:t>。</w:t>
-      </w:r>
-      <w:r>
-        <w:rPr>
-          <w:rFonts w:hint="eastAsia"/>
-        </w:rPr>
-        <w:t>兼容的前提是要能知道对端的版本号。</w:t>
-      </w:r>
-      <w:r>
-        <w:rPr>
-          <w:rFonts w:hint="eastAsia"/>
-        </w:rPr>
-        <w:t>本设计中，在原来的</w:t>
-      </w:r>
-      <w:r>
-        <w:rPr>
-          <w:rFonts w:hint="eastAsia"/>
-        </w:rPr>
-        <w:t xml:space="preserve"> opcode </w:t>
-      </w:r>
-      <w:r>
-        <w:rPr>
-          <w:rFonts w:hint="eastAsia"/>
-        </w:rPr>
-        <w:t>字段前插入一个新的字段，利用应答消息中</w:t>
-      </w:r>
-      <w:r>
-        <w:rPr>
-          <w:rFonts w:hint="eastAsia"/>
-        </w:rPr>
-        <w:t xml:space="preserve"> opcode </w:t>
-      </w:r>
-      <w:r>
-        <w:rPr>
-          <w:rFonts w:hint="eastAsia"/>
-        </w:rPr>
-        <w:t>最高位会被置为</w:t>
-      </w:r>
-      <w:r>
-        <w:rPr>
-          <w:rFonts w:hint="eastAsia"/>
-        </w:rPr>
-        <w:t xml:space="preserve"> 1 </w:t>
-      </w:r>
-      <w:r>
-        <w:rPr>
-          <w:rFonts w:hint="eastAsia"/>
-        </w:rPr>
-        <w:t>的逻辑来进行识别。</w:t>
-      </w:r>
-    </w:p>
-    <w:p>
-      <w:pPr>
-        <w:ind w:left="0"/>
-      </w:pPr>
-      <w:r>
-        <w:tab/>
-      </w:r>
-      <w:r>
-        <w:rPr>
-          <w:rFonts w:hint="eastAsia"/>
-        </w:rPr>
-        <w:t>新版本在构造消息时（无论是请求还是应答），其消息头中都要填上复合版本号，</w:t>
-      </w:r>
-      <w:r>
-        <w:rPr>
-          <w:rFonts w:hint="eastAsia"/>
-        </w:rPr>
-        <w:t>低</w:t>
-      </w:r>
-      <w:r>
-        <w:rPr>
-          <w:rFonts w:hint="eastAsia"/>
-        </w:rPr>
-        <w:t>16</w:t>
-      </w:r>
-      <w:r>
-        <w:rPr>
-          <w:rFonts w:hint="eastAsia"/>
-        </w:rPr>
-        <w:t>位为基础版本号，将第二高位置为</w:t>
-      </w:r>
-      <w:r>
-        <w:rPr>
-          <w:rFonts w:hint="eastAsia"/>
-        </w:rPr>
-        <w:t>1</w:t>
-      </w:r>
-      <w:r>
-        <w:rPr>
-          <w:rFonts w:hint="eastAsia"/>
-        </w:rPr>
-        <w:t>（使其值在最大消息码</w:t>
-      </w:r>
-      <w:r>
-        <w:rPr>
-          <w:rFonts w:hint="eastAsia"/>
-        </w:rPr>
-        <w:t>999999</w:t>
-      </w:r>
-      <w:r>
-        <w:rPr>
-          <w:rFonts w:hint="eastAsia"/>
-        </w:rPr>
-        <w:t>之外）</w:t>
-      </w:r>
-      <w:r>
-        <w:rPr>
-          <w:rFonts w:hint="eastAsia"/>
-        </w:rPr>
-        <w:t>。当老版本收到该消息之后，</w:t>
-      </w:r>
-      <w:r>
-        <w:rPr>
-          <w:rFonts w:hint="eastAsia"/>
-        </w:rPr>
-        <w:t>会将其作为命令码</w:t>
-      </w:r>
-      <w:r>
-        <w:rPr>
-          <w:rFonts w:hint="eastAsia"/>
-        </w:rPr>
-        <w:t>解析，</w:t>
-      </w:r>
-      <w:r>
-        <w:rPr>
-          <w:rFonts w:hint="eastAsia"/>
-        </w:rPr>
-        <w:t>将无法识别该</w:t>
-      </w:r>
-      <w:r>
-        <w:rPr>
-          <w:rFonts w:hint="eastAsia"/>
-        </w:rPr>
-        <w:t>命令</w:t>
-      </w:r>
-      <w:r>
-        <w:rPr>
-          <w:rFonts w:hint="eastAsia"/>
-        </w:rPr>
-        <w:t>码，但仍会将最高位置</w:t>
-      </w:r>
-      <w:r>
-        <w:rPr>
-          <w:rFonts w:hint="eastAsia"/>
-        </w:rPr>
-        <w:t>1</w:t>
-      </w:r>
-      <w:r>
-        <w:rPr>
-          <w:rFonts w:hint="eastAsia"/>
-        </w:rPr>
-        <w:t>。而对于新版本，则不会对高位进行修改。</w:t>
-      </w:r>
-      <w:r>
-        <w:rPr>
-          <w:rFonts w:hint="eastAsia"/>
-        </w:rPr>
-        <w:t>如果版本一致，则应答中的</w:t>
-      </w:r>
-      <w:r>
-        <w:rPr>
-          <w:rFonts w:hint="eastAsia"/>
-        </w:rPr>
-        <w:t xml:space="preserve"> version </w:t>
-      </w:r>
-      <w:r>
-        <w:rPr>
-          <w:rFonts w:hint="eastAsia"/>
-        </w:rPr>
-        <w:t>与请求中一致，如果不一致，则应答中为本端的版本号。</w:t>
-      </w:r>
-    </w:p>
-    <w:p>
-      <w:pPr>
-        <w:ind w:left="0"/>
-      </w:pPr>
-      <w:r>
-        <w:tab/>
-      </w:r>
-      <w:r>
-        <w:rPr>
-          <w:rFonts w:hint="eastAsia"/>
-        </w:rPr>
-        <w:t>下图分别为新版本请求中的</w:t>
-      </w:r>
-      <w:r>
-        <w:rPr>
-          <w:rFonts w:hint="eastAsia"/>
-        </w:rPr>
-        <w:t xml:space="preserve"> versio</w:t>
-      </w:r>
-      <w:r>
-        <w:t>n</w:t>
-      </w:r>
-      <w:r>
-        <w:rPr>
-          <w:rFonts w:hint="eastAsia"/>
-        </w:rPr>
-        <w:t>、新版本应答中的</w:t>
-      </w:r>
-      <w:r>
-        <w:rPr>
-          <w:rFonts w:hint="eastAsia"/>
-        </w:rPr>
-        <w:t xml:space="preserve"> version</w:t>
-      </w:r>
-      <w:r>
-        <w:rPr>
-          <w:rFonts w:hint="eastAsia"/>
-        </w:rPr>
-        <w:t>及老版本应答中的</w:t>
-      </w:r>
-      <w:r>
-        <w:rPr>
-          <w:rFonts w:hint="eastAsia"/>
-        </w:rPr>
-        <w:t xml:space="preserve"> version</w:t>
-      </w:r>
-      <w:r>
-        <w:rPr>
-          <w:rFonts w:hint="eastAsia"/>
-        </w:rPr>
-        <w:t>。</w:t>
-      </w:r>
-    </w:p>
-    <w:p>
-      <w:pPr>
-        <w:ind w:left="0"/>
-        <w:jc w:val="center"/>
-        <w:rPr>
-          <w:rFonts w:hint="eastAsia"/>
-        </w:rPr>
-      </w:pPr>
-      <w:r>
-        <w:rPr>
-          <w:rFonts w:hint="eastAsia"/>
-          <w:noProof/>
-        </w:rPr>
-        <w:drawing>
-          <wp:inline distT="0" distB="0" distL="0" distR="0" wp14:anchorId="4ED0A39E" wp14:editId="498C32F9">
-            <wp:extent cx="2333502" cy="1310701"/>
-            <wp:effectExtent l="0" t="0" r="0" b="0"/>
-            <wp:docPr id="10" name="图片 10"/>
-            <wp:cNvGraphicFramePr>
-              <a:graphicFrameLocks xmlns:a="http://schemas.openxmlformats.org/drawingml/2006/main" noChangeAspect="1"/>
-            </wp:cNvGraphicFramePr>
-            <a:graphic xmlns:a="http://schemas.openxmlformats.org/drawingml/2006/main">
-              <a:graphicData uri="http://schemas.openxmlformats.org/drawingml/2006/picture">
-                <pic:pic xmlns:pic="http://schemas.openxmlformats.org/drawingml/2006/picture">
-                  <pic:nvPicPr>
-                    <pic:cNvPr id="10" name="version-structure.png"/>
+                    <pic:cNvPr id="3" name="msg-structure.png"/>
                     <pic:cNvPicPr/>
                   </pic:nvPicPr>
                   <pic:blipFill>
@@ -990,7 +502,7 @@
                   <pic:spPr>
                     <a:xfrm>
                       <a:off x="0" y="0"/>
-                      <a:ext cx="2352197" cy="1321202"/>
+                      <a:ext cx="5274310" cy="1345565"/>
                     </a:xfrm>
                     <a:prstGeom prst="rect">
                       <a:avLst/>
@@ -1008,19 +520,274 @@
         <w:pStyle w:val="4"/>
       </w:pPr>
       <w:r>
-        <w:tab/>
-      </w:r>
-      <w:r>
-        <w:rPr>
-          <w:rFonts w:hint="eastAsia"/>
-        </w:rPr>
-        <w:t>f</w:t>
-      </w:r>
-      <w:r>
-        <w:t>lag</w:t>
+        <w:t>eye</w:t>
       </w:r>
     </w:p>
     <w:p>
+      <w:pPr>
+        <w:ind w:left="0"/>
+        <w:rPr>
+          <w:rFonts w:hint="eastAsia"/>
+        </w:rPr>
+      </w:pPr>
+      <w:r>
+        <w:tab/>
+      </w:r>
+      <w:r>
+        <w:rPr>
+          <w:rFonts w:hint="eastAsia"/>
+        </w:rPr>
+        <w:t>此次</w:t>
+      </w:r>
+      <w:r>
+        <w:rPr>
+          <w:rFonts w:hint="eastAsia"/>
+        </w:rPr>
+        <w:t>消息升级的一个特殊标识</w:t>
+      </w:r>
+      <w:r>
+        <w:rPr>
+          <w:rFonts w:hint="eastAsia"/>
+        </w:rPr>
+        <w:t>，在新版本消息中其值为</w:t>
+      </w:r>
+      <w:r>
+        <w:rPr>
+          <w:rFonts w:hint="eastAsia"/>
+        </w:rPr>
+        <w:t>0</w:t>
+      </w:r>
+      <w:r>
+        <w:rPr>
+          <w:rFonts w:hint="eastAsia"/>
+        </w:rPr>
+        <w:t>。由于此前的消息中都未</w:t>
+      </w:r>
+      <w:r>
+        <w:rPr>
+          <w:rFonts w:hint="eastAsia"/>
+        </w:rPr>
+        <w:t>携带版本号，为了在兼容的前提下进行本次协议升级，使用这个特殊的字段来进行版本识别</w:t>
+      </w:r>
+      <w:r>
+        <w:rPr>
+          <w:rFonts w:hint="eastAsia"/>
+        </w:rPr>
+        <w:t>，其原理是利用应答消息会将请求消息中携带的</w:t>
+      </w:r>
+      <w:r>
+        <w:rPr>
+          <w:rFonts w:hint="eastAsia"/>
+        </w:rPr>
+        <w:t xml:space="preserve"> opcode </w:t>
+      </w:r>
+      <w:r>
+        <w:rPr>
+          <w:rFonts w:hint="eastAsia"/>
+        </w:rPr>
+        <w:t>的最高位置为</w:t>
+      </w:r>
+      <w:r>
+        <w:rPr>
+          <w:rFonts w:hint="eastAsia"/>
+        </w:rPr>
+        <w:t xml:space="preserve"> 1 </w:t>
+      </w:r>
+      <w:r>
+        <w:rPr>
+          <w:rFonts w:hint="eastAsia"/>
+        </w:rPr>
+        <w:t>的逻辑。</w:t>
+      </w:r>
+      <w:r>
+        <w:rPr>
+          <w:rFonts w:hint="eastAsia"/>
+        </w:rPr>
+        <w:t>由于增加的这个字段占据老版本中</w:t>
+      </w:r>
+      <w:r>
+        <w:rPr>
+          <w:rFonts w:hint="eastAsia"/>
+        </w:rPr>
+        <w:t xml:space="preserve"> opcode </w:t>
+      </w:r>
+      <w:r>
+        <w:rPr>
+          <w:rFonts w:hint="eastAsia"/>
+        </w:rPr>
+        <w:t>的位置，因此当新版本的消息发送到老版本的节点时，在其应答消息中，</w:t>
+      </w:r>
+      <w:r>
+        <w:rPr>
+          <w:rFonts w:hint="eastAsia"/>
+        </w:rPr>
+        <w:t>这个字段的值会被修改，其值会变成非</w:t>
+      </w:r>
+      <w:r>
+        <w:rPr>
+          <w:rFonts w:hint="eastAsia"/>
+        </w:rPr>
+        <w:t>0</w:t>
+      </w:r>
+      <w:r>
+        <w:rPr>
+          <w:rFonts w:hint="eastAsia"/>
+        </w:rPr>
+        <w:t>。</w:t>
+      </w:r>
+      <w:r>
+        <w:rPr>
+          <w:rFonts w:hint="eastAsia"/>
+        </w:rPr>
+        <w:t>而如果通信两端均为新版本，则不会修改这个值。</w:t>
+      </w:r>
+      <w:r>
+        <w:rPr>
+          <w:rFonts w:hint="eastAsia"/>
+        </w:rPr>
+        <w:t>如，最高位修改的情况下，请求及应答消息中的</w:t>
+      </w:r>
+      <w:r>
+        <w:rPr>
+          <w:rFonts w:hint="eastAsia"/>
+        </w:rPr>
+        <w:t xml:space="preserve"> eye </w:t>
+      </w:r>
+      <w:r>
+        <w:rPr>
+          <w:rFonts w:hint="eastAsia"/>
+        </w:rPr>
+        <w:t>值如下图所示。</w:t>
+      </w:r>
+    </w:p>
+    <w:p>
+      <w:pPr>
+        <w:ind w:left="0"/>
+        <w:jc w:val="center"/>
+      </w:pPr>
+      <w:r>
+        <w:rPr>
+          <w:noProof/>
+        </w:rPr>
+        <w:drawing>
+          <wp:inline distT="0" distB="0" distL="0" distR="0" wp14:anchorId="21A16B2E" wp14:editId="477A84B0">
+            <wp:extent cx="2933700" cy="1857375"/>
+            <wp:effectExtent l="0" t="0" r="0" b="0"/>
+            <wp:docPr id="4" name="图片 4"/>
+            <wp:cNvGraphicFramePr>
+              <a:graphicFrameLocks xmlns:a="http://schemas.openxmlformats.org/drawingml/2006/main" noChangeAspect="1"/>
+            </wp:cNvGraphicFramePr>
+            <a:graphic xmlns:a="http://schemas.openxmlformats.org/drawingml/2006/main">
+              <a:graphicData uri="http://schemas.openxmlformats.org/drawingml/2006/picture">
+                <pic:pic xmlns:pic="http://schemas.openxmlformats.org/drawingml/2006/picture">
+                  <pic:nvPicPr>
+                    <pic:cNvPr id="4" name="msg-eye.png"/>
+                    <pic:cNvPicPr/>
+                  </pic:nvPicPr>
+                  <pic:blipFill>
+                    <a:blip r:embed="rId9">
+                      <a:extLst>
+                        <a:ext uri="{28A0092B-C50C-407E-A947-70E740481C1C}">
+                          <a14:useLocalDpi xmlns:a14="http://schemas.microsoft.com/office/drawing/2010/main" val="0"/>
+                        </a:ext>
+                      </a:extLst>
+                    </a:blip>
+                    <a:stretch>
+                      <a:fillRect/>
+                    </a:stretch>
+                  </pic:blipFill>
+                  <pic:spPr>
+                    <a:xfrm>
+                      <a:off x="0" y="0"/>
+                      <a:ext cx="2933700" cy="1857375"/>
+                    </a:xfrm>
+                    <a:prstGeom prst="rect">
+                      <a:avLst/>
+                    </a:prstGeom>
+                  </pic:spPr>
+                </pic:pic>
+              </a:graphicData>
+            </a:graphic>
+          </wp:inline>
+        </w:drawing>
+      </w:r>
+    </w:p>
+    <w:p>
+      <w:pPr>
+        <w:pStyle w:val="4"/>
+      </w:pPr>
+      <w:r>
+        <w:t>v</w:t>
+      </w:r>
+      <w:r>
+        <w:t>ersion</w:t>
+      </w:r>
+    </w:p>
+    <w:p>
+      <w:r>
+        <w:rPr>
+          <w:rFonts w:hint="eastAsia"/>
+        </w:rPr>
+        <w:t>协议版本号</w:t>
+      </w:r>
+      <w:r>
+        <w:rPr>
+          <w:rFonts w:hint="eastAsia"/>
+        </w:rPr>
+        <w:t>，值从</w:t>
+      </w:r>
+      <w:r>
+        <w:rPr>
+          <w:rFonts w:hint="eastAsia"/>
+        </w:rPr>
+        <w:t>1</w:t>
+      </w:r>
+      <w:r>
+        <w:rPr>
+          <w:rFonts w:hint="eastAsia"/>
+        </w:rPr>
+        <w:t>向上递增。</w:t>
+      </w:r>
+      <w:r>
+        <w:rPr>
+          <w:rFonts w:hint="eastAsia"/>
+        </w:rPr>
+        <w:t>将老版本的版本号定义为</w:t>
+      </w:r>
+      <w:r>
+        <w:rPr>
+          <w:rFonts w:hint="eastAsia"/>
+        </w:rPr>
+        <w:t>1</w:t>
+      </w:r>
+      <w:r>
+        <w:rPr>
+          <w:rFonts w:hint="eastAsia"/>
+        </w:rPr>
+        <w:t>，但老版本的消息中实际不存在该字段。当前版本号定义为</w:t>
+      </w:r>
+      <w:r>
+        <w:rPr>
+          <w:rFonts w:hint="eastAsia"/>
+        </w:rPr>
+        <w:t>2.</w:t>
+      </w:r>
+    </w:p>
+    <w:p>
+      <w:pPr>
+        <w:pStyle w:val="4"/>
+      </w:pPr>
+      <w:r>
+        <w:rPr>
+          <w:rFonts w:hint="eastAsia"/>
+        </w:rPr>
+        <w:t>f</w:t>
+      </w:r>
+      <w:r>
+        <w:t>lag</w:t>
+      </w:r>
+    </w:p>
+    <w:p>
       <w:r>
         <w:rPr>
           <w:rFonts w:hint="eastAsia"/>
@@ -1088,7 +855,7 @@
         <w:rPr>
           <w:rFonts w:hint="eastAsia"/>
         </w:rPr>
-        <w:t>计划支持的</w:t>
+        <w:t>支持的</w:t>
       </w:r>
       <w:r>
         <w:rPr>
@@ -1147,7 +914,7 @@
                 <w:sz w:val="18"/>
                 <w:szCs w:val="18"/>
               </w:rPr>
-              <w:t>FLAG_ENABLE_STAT</w:t>
+              <w:t>FLAG_RESULT_DETAIL</w:t>
             </w:r>
           </w:p>
         </w:tc>
@@ -1168,7 +935,15 @@
                 <w:sz w:val="18"/>
                 <w:szCs w:val="18"/>
               </w:rPr>
-              <w:t>0x00000001</w:t>
+              <w:t>0x000000</w:t>
+            </w:r>
+            <w:r>
+              <w:rPr>
+                <w:rFonts w:hint="eastAsia"/>
+                <w:sz w:val="18"/>
+                <w:szCs w:val="18"/>
+              </w:rPr>
+              <w:t>01</w:t>
             </w:r>
           </w:p>
         </w:tc>
@@ -1189,274 +964,6 @@
                 <w:sz w:val="18"/>
                 <w:szCs w:val="18"/>
               </w:rPr>
-              <w:t>开启统计信息</w:t>
-            </w:r>
-          </w:p>
-        </w:tc>
-      </w:tr>
-      <w:tr>
-        <w:tc>
-          <w:tcPr>
-            <w:tcW w:w="3147" w:type="dxa"/>
-          </w:tcPr>
-          <w:p>
-            <w:pPr>
-              <w:rPr>
-                <w:color w:val="0000CC"/>
-                <w:sz w:val="18"/>
-                <w:szCs w:val="18"/>
-              </w:rPr>
-            </w:pPr>
-            <w:r>
-              <w:rPr>
-                <w:rFonts w:hint="eastAsia"/>
-                <w:color w:val="0000CC"/>
-                <w:sz w:val="18"/>
-                <w:szCs w:val="18"/>
-              </w:rPr>
-              <w:t>FLAG_ENABLE_EXPLAIN</w:t>
-            </w:r>
-          </w:p>
-        </w:tc>
-        <w:tc>
-          <w:tcPr>
-            <w:tcW w:w="2059" w:type="dxa"/>
-          </w:tcPr>
-          <w:p>
-            <w:pPr>
-              <w:rPr>
-                <w:sz w:val="18"/>
-                <w:szCs w:val="18"/>
-              </w:rPr>
-            </w:pPr>
-            <w:r>
-              <w:rPr>
-                <w:rFonts w:hint="eastAsia"/>
-                <w:sz w:val="18"/>
-                <w:szCs w:val="18"/>
-              </w:rPr>
-              <w:t>0x00000002</w:t>
-            </w:r>
-          </w:p>
-        </w:tc>
-        <w:tc>
-          <w:tcPr>
-            <w:tcW w:w="2846" w:type="dxa"/>
-          </w:tcPr>
-          <w:p>
-            <w:pPr>
-              <w:rPr>
-                <w:sz w:val="18"/>
-                <w:szCs w:val="18"/>
-              </w:rPr>
-            </w:pPr>
-            <w:r>
-              <w:rPr>
-                <w:rFonts w:hint="eastAsia"/>
-                <w:sz w:val="18"/>
-                <w:szCs w:val="18"/>
-              </w:rPr>
-              <w:t>开启访问计划信息</w:t>
-            </w:r>
-          </w:p>
-        </w:tc>
-      </w:tr>
-      <w:tr>
-        <w:tc>
-          <w:tcPr>
-            <w:tcW w:w="3147" w:type="dxa"/>
-          </w:tcPr>
-          <w:p>
-            <w:pPr>
-              <w:rPr>
-                <w:color w:val="0000CC"/>
-                <w:sz w:val="18"/>
-                <w:szCs w:val="18"/>
-              </w:rPr>
-            </w:pPr>
-            <w:r>
-              <w:rPr>
-                <w:rFonts w:hint="eastAsia"/>
-                <w:color w:val="0000CC"/>
-                <w:sz w:val="18"/>
-                <w:szCs w:val="18"/>
-              </w:rPr>
-              <w:t>FLAG_ENABLE_FLOW</w:t>
-            </w:r>
-          </w:p>
-        </w:tc>
-        <w:tc>
-          <w:tcPr>
-            <w:tcW w:w="2059" w:type="dxa"/>
-          </w:tcPr>
-          <w:p>
-            <w:pPr>
-              <w:rPr>
-                <w:sz w:val="18"/>
-                <w:szCs w:val="18"/>
-              </w:rPr>
-            </w:pPr>
-            <w:r>
-              <w:rPr>
-                <w:rFonts w:hint="eastAsia"/>
-                <w:sz w:val="18"/>
-                <w:szCs w:val="18"/>
-              </w:rPr>
-              <w:t>0x00000004</w:t>
-            </w:r>
-          </w:p>
-        </w:tc>
-        <w:tc>
-          <w:tcPr>
-            <w:tcW w:w="2846" w:type="dxa"/>
-          </w:tcPr>
-          <w:p>
-            <w:pPr>
-              <w:rPr>
-                <w:sz w:val="18"/>
-                <w:szCs w:val="18"/>
-              </w:rPr>
-            </w:pPr>
-            <w:r>
-              <w:rPr>
-                <w:rFonts w:hint="eastAsia"/>
-                <w:sz w:val="18"/>
-                <w:szCs w:val="18"/>
-              </w:rPr>
-              <w:t>开启流程跟踪信息</w:t>
-            </w:r>
-          </w:p>
-        </w:tc>
-      </w:tr>
-      <w:tr>
-        <w:tc>
-          <w:tcPr>
-            <w:tcW w:w="3147" w:type="dxa"/>
-          </w:tcPr>
-          <w:p>
-            <w:pPr>
-              <w:rPr>
-                <w:color w:val="0000CC"/>
-                <w:sz w:val="18"/>
-                <w:szCs w:val="18"/>
-              </w:rPr>
-            </w:pPr>
-            <w:r>
-              <w:rPr>
-                <w:rFonts w:hint="eastAsia"/>
-                <w:color w:val="0000CC"/>
-                <w:sz w:val="18"/>
-                <w:szCs w:val="18"/>
-              </w:rPr>
-              <w:t>FLAG_ENABLE_DEBUG</w:t>
-            </w:r>
-          </w:p>
-        </w:tc>
-        <w:tc>
-          <w:tcPr>
-            <w:tcW w:w="2059" w:type="dxa"/>
-          </w:tcPr>
-          <w:p>
-            <w:pPr>
-              <w:rPr>
-                <w:sz w:val="18"/>
-                <w:szCs w:val="18"/>
-              </w:rPr>
-            </w:pPr>
-            <w:r>
-              <w:rPr>
-                <w:rFonts w:hint="eastAsia"/>
-                <w:sz w:val="18"/>
-                <w:szCs w:val="18"/>
-              </w:rPr>
-              <w:t>0x00000008</w:t>
-            </w:r>
-          </w:p>
-        </w:tc>
-        <w:tc>
-          <w:tcPr>
-            <w:tcW w:w="2846" w:type="dxa"/>
-          </w:tcPr>
-          <w:p>
-            <w:pPr>
-              <w:rPr>
-                <w:sz w:val="18"/>
-                <w:szCs w:val="18"/>
-              </w:rPr>
-            </w:pPr>
-            <w:r>
-              <w:rPr>
-                <w:rFonts w:hint="eastAsia"/>
-                <w:sz w:val="18"/>
-                <w:szCs w:val="18"/>
-              </w:rPr>
-              <w:t>开启调测信息</w:t>
-            </w:r>
-          </w:p>
-        </w:tc>
-      </w:tr>
-      <w:tr>
-        <w:tc>
-          <w:tcPr>
-            <w:tcW w:w="3147" w:type="dxa"/>
-          </w:tcPr>
-          <w:p>
-            <w:pPr>
-              <w:rPr>
-                <w:color w:val="0000CC"/>
-                <w:sz w:val="18"/>
-                <w:szCs w:val="18"/>
-              </w:rPr>
-            </w:pPr>
-            <w:r>
-              <w:rPr>
-                <w:rFonts w:hint="eastAsia"/>
-                <w:color w:val="0000CC"/>
-                <w:sz w:val="18"/>
-                <w:szCs w:val="18"/>
-              </w:rPr>
-              <w:t>FLAG_RESULT_DETAIL</w:t>
-            </w:r>
-          </w:p>
-        </w:tc>
-        <w:tc>
-          <w:tcPr>
-            <w:tcW w:w="2059" w:type="dxa"/>
-          </w:tcPr>
-          <w:p>
-            <w:pPr>
-              <w:rPr>
-                <w:sz w:val="18"/>
-                <w:szCs w:val="18"/>
-              </w:rPr>
-            </w:pPr>
-            <w:r>
-              <w:rPr>
-                <w:rFonts w:hint="eastAsia"/>
-                <w:sz w:val="18"/>
-                <w:szCs w:val="18"/>
-              </w:rPr>
-              <w:t>0x00000010</w:t>
-            </w:r>
-          </w:p>
-        </w:tc>
-        <w:tc>
-          <w:tcPr>
-            <w:tcW w:w="2846" w:type="dxa"/>
-          </w:tcPr>
-          <w:p>
-            <w:pPr>
-              <w:rPr>
-                <w:sz w:val="18"/>
-                <w:szCs w:val="18"/>
-              </w:rPr>
-            </w:pPr>
-            <w:r>
-              <w:rPr>
-                <w:rFonts w:hint="eastAsia"/>
-                <w:sz w:val="18"/>
-                <w:szCs w:val="18"/>
-              </w:rPr>
               <w:t>开启详细结果</w:t>
             </w:r>
             <w:r>
@@ -1483,30 +990,6 @@
         <w:rPr>
           <w:rFonts w:hint="eastAsia"/>
         </w:rPr>
-        <w:t>近期要实现支持的是</w:t>
-      </w:r>
-      <w:r>
-        <w:rPr>
-          <w:rFonts w:hint="eastAsia"/>
-        </w:rPr>
-        <w:t xml:space="preserve"> FLAG_RESULT_DETAIL</w:t>
-      </w:r>
-      <w:r>
-        <w:rPr>
-          <w:rFonts w:hint="eastAsia"/>
-        </w:rPr>
-        <w:t>，用来返回写操作的结果及错误信息。</w:t>
-      </w:r>
-      <w:r>
-        <w:tab/>
-      </w:r>
-      <w:r>
-        <w:tab/>
-      </w:r>
-      <w:r>
-        <w:rPr>
-          <w:rFonts w:hint="eastAsia"/>
-        </w:rPr>
         <w:t>这里的</w:t>
       </w:r>
       <w:r>
@@ -1599,6 +1082,7 @@
         <w:ind w:left="0"/>
       </w:pPr>
       <w:r>
+        <w:lastRenderedPageBreak/>
         <w:tab/>
       </w:r>
       <w:r>
@@ -1868,17 +1352,13 @@
         <w:rPr>
           <w:rFonts w:hint="eastAsia"/>
         </w:rPr>
-        <w:t>的设置和清除：</w:t>
+        <w:t>的设置和清除。</w:t>
       </w:r>
     </w:p>
     <w:p>
       <w:pPr>
         <w:ind w:left="0"/>
       </w:pPr>
-      <w:r>
-        <w:tab/>
-        <w:t>void setOpFlags( INT32 flags ) ;</w:t>
-      </w:r>
     </w:p>
     <w:p>
       <w:pPr>
@@ -1886,54 +1366,97 @@
       </w:pPr>
       <w:r>
         <w:tab/>
-        <w:t>void clearOpFlags() ;</w:t>
+      </w:r>
+      <w:r>
+        <w:rPr>
+          <w:rFonts w:hint="eastAsia"/>
+        </w:rPr>
+        <w:t>当前不考虑对外提供设置接口，在代码中强制指定详细信息</w:t>
+      </w:r>
+      <w:r>
+        <w:rPr>
+          <w:rFonts w:hint="eastAsia"/>
+        </w:rPr>
+        <w:t xml:space="preserve"> flag</w:t>
+      </w:r>
+      <w:r>
+        <w:rPr>
+          <w:rFonts w:hint="eastAsia"/>
+        </w:rPr>
+        <w:t>。</w:t>
+      </w:r>
+      <w:r>
+        <w:t xml:space="preserve"> </w:t>
       </w:r>
     </w:p>
     <w:p>
       <w:pPr>
-        <w:ind w:left="0"/>
-      </w:pPr>
-      <w:r>
-        <w:tab/>
-      </w:r>
-      <w:r>
-        <w:rPr>
-          <w:rFonts w:hint="eastAsia"/>
-        </w:rPr>
-        <w:t>接口</w:t>
-      </w:r>
-      <w:r>
-        <w:rPr>
-          <w:rFonts w:hint="eastAsia"/>
-        </w:rPr>
-        <w:t>在驱动及</w:t>
-      </w:r>
-      <w:r>
-        <w:rPr>
-          <w:rFonts w:hint="eastAsia"/>
-        </w:rPr>
-        <w:t xml:space="preserve"> sdb </w:t>
-      </w:r>
-      <w:r>
-        <w:rPr>
-          <w:rFonts w:hint="eastAsia"/>
-        </w:rPr>
-        <w:t>中均提供。</w:t>
+        <w:pStyle w:val="4"/>
+      </w:pPr>
+      <w:r>
+        <w:t>g</w:t>
+      </w:r>
+      <w:r>
+        <w:rPr>
+          <w:rFonts w:hint="eastAsia"/>
+        </w:rPr>
+        <w:t>lobal</w:t>
+      </w:r>
+      <w:r>
+        <w:t xml:space="preserve"> </w:t>
+      </w:r>
+      <w:r>
+        <w:rPr>
+          <w:rFonts w:hint="eastAsia"/>
+        </w:rPr>
+        <w:t>ID</w:t>
       </w:r>
     </w:p>
     <w:p>
+      <w:r>
+        <w:rPr>
+          <w:rFonts w:hint="eastAsia"/>
+        </w:rPr>
+        <w:t>规划预留字段，当前不实际使用。用来唯一标识一个消息，在问题处理等场景下跟踪一个消息的转移路径。</w:t>
+      </w:r>
+    </w:p>
+    <w:p>
+      <w:pPr>
+        <w:pStyle w:val="4"/>
+        <w:rPr>
+          <w:rFonts w:hint="eastAsia"/>
+        </w:rPr>
+      </w:pPr>
+      <w:r>
+        <w:t>r</w:t>
+      </w:r>
+      <w:r>
+        <w:rPr>
+          <w:rFonts w:hint="eastAsia"/>
+        </w:rPr>
+        <w:t>eserve</w:t>
+      </w:r>
+    </w:p>
+    <w:p>
+      <w:pPr>
+        <w:rPr>
+          <w:rFonts w:hint="eastAsia"/>
+        </w:rPr>
+      </w:pPr>
+      <w:r>
+        <w:rPr>
+          <w:rFonts w:hint="eastAsia"/>
+        </w:rPr>
+        <w:t>预留位</w:t>
+      </w:r>
+    </w:p>
+    <w:p>
       <w:pPr>
         <w:ind w:left="0"/>
-      </w:pPr>
-      <w:r>
-        <w:tab/>
-      </w:r>
-      <w:r>
-        <w:rPr>
-          <w:rFonts w:hint="eastAsia"/>
-        </w:rPr>
-        <w:t>本设计采用第二种方案，将这些控制标识在通用消息头中单独管理。</w:t>
-      </w:r>
+        <w:rPr>
+          <w:rFonts w:hint="eastAsia"/>
+        </w:rPr>
+      </w:pPr>
     </w:p>
     <w:p>
       <w:pPr>
@@ -3777,54 +3300,6 @@
                 </w:p>
               </w:tc>
             </w:tr>
-            <w:tr>
-              <w:tc>
-                <w:tcPr>
-                  <w:tcW w:w="3431" w:type="dxa"/>
-                </w:tcPr>
-                <w:p>
-                  <w:pPr>
-                    <w:rPr>
-                      <w:color w:val="0000CC"/>
-                      <w:sz w:val="18"/>
-                      <w:szCs w:val="18"/>
-                    </w:rPr>
-                  </w:pPr>
-                  <w:r>
-                    <w:rPr>
-                      <w:rFonts w:hint="eastAsia"/>
-                      <w:color w:val="0000CC"/>
-                      <w:sz w:val="18"/>
-                      <w:szCs w:val="18"/>
-                    </w:rPr>
-                    <w:t>SDB_REPLY_MASK_PROCESS</w:t>
-                  </w:r>
-                </w:p>
-              </w:tc>
-              <w:tc>
-                <w:tcPr>
-                  <w:tcW w:w="1775" w:type="dxa"/>
-                </w:tcPr>
-                <w:p>
-                  <w:pPr>
-                    <w:rPr>
-                      <w:color w:val="0000CC"/>
-                      <w:sz w:val="18"/>
-                      <w:szCs w:val="18"/>
-                    </w:rPr>
-                  </w:pPr>
-                  <w:r>
-                    <w:rPr>
-                      <w:rFonts w:hint="eastAsia"/>
-                      <w:color w:val="0000CC"/>
-                      <w:sz w:val="18"/>
-                      <w:szCs w:val="18"/>
-                    </w:rPr>
-                    <w:t>0x02</w:t>
-                  </w:r>
-                </w:p>
-              </w:tc>
-            </w:tr>
           </w:tbl>
           <w:p>
             <w:pPr>
@@ -3878,6 +3353,7 @@
                 <w:sz w:val="18"/>
                 <w:szCs w:val="18"/>
               </w:rPr>
+              <w:lastRenderedPageBreak/>
               <w:t>Reserved</w:t>
             </w:r>
           </w:p>
@@ -4058,7 +3534,6 @@
                 <w:sz w:val="18"/>
                 <w:szCs w:val="18"/>
               </w:rPr>
-              <w:lastRenderedPageBreak/>
               <w:t>{</w:t>
             </w:r>
           </w:p>
@@ -4250,7 +3725,6 @@
                 <w:sz w:val="18"/>
                 <w:szCs w:val="18"/>
               </w:rPr>
-              <w:lastRenderedPageBreak/>
               <w:t>Data BSONS</w:t>
             </w:r>
           </w:p>
@@ -4762,83 +4236,6 @@
     </w:p>
     <w:p>
       <w:pPr>
-        <w:jc w:val="left"/>
-      </w:pPr>
-      <w:r>
-        <w:rPr>
-          <w:rFonts w:hint="eastAsia"/>
-        </w:rPr>
-        <w:t>当请求消息中指定了</w:t>
-      </w:r>
-      <w:r>
-        <w:rPr>
-          <w:rFonts w:hint="eastAsia"/>
-        </w:rPr>
-        <w:t xml:space="preserve"> FLAG_RESULT_DETAIL </w:t>
-      </w:r>
-      <w:r>
-        <w:rPr>
-          <w:rFonts w:hint="eastAsia"/>
-        </w:rPr>
-        <w:t>时，应答消息中将包含</w:t>
-      </w:r>
-      <w:r>
-        <w:rPr>
-          <w:rFonts w:hint="eastAsia"/>
-        </w:rPr>
-        <w:t xml:space="preserve"> SDB_REPLY_MASK_RESULT </w:t>
-      </w:r>
-      <w:r>
-        <w:rPr>
-          <w:rFonts w:hint="eastAsia"/>
-        </w:rPr>
-        <w:t>及</w:t>
-      </w:r>
-      <w:r>
-        <w:rPr>
-          <w:rFonts w:hint="eastAsia"/>
-        </w:rPr>
-        <w:t xml:space="preserve"> Result BSON</w:t>
-      </w:r>
-      <w:r>
-        <w:rPr>
-          <w:rFonts w:hint="eastAsia"/>
-        </w:rPr>
-        <w:t>。</w:t>
-      </w:r>
-      <w:r>
-        <w:rPr>
-          <w:rFonts w:hint="eastAsia"/>
-        </w:rPr>
-        <w:t>在返回记录写操作的受影响行数等信息时，将其整合到</w:t>
-      </w:r>
-      <w:r>
-        <w:rPr>
-          <w:rFonts w:hint="eastAsia"/>
-        </w:rPr>
-        <w:t xml:space="preserve"> Result BSON </w:t>
-      </w:r>
-      <w:r>
-        <w:rPr>
-          <w:rFonts w:hint="eastAsia"/>
-        </w:rPr>
-        <w:t>中的</w:t>
-      </w:r>
-      <w:r>
-        <w:rPr>
-          <w:rFonts w:hint="eastAsia"/>
-        </w:rPr>
-        <w:t xml:space="preserve"> Write </w:t>
-      </w:r>
-      <w:r>
-        <w:rPr>
-          <w:rFonts w:hint="eastAsia"/>
-        </w:rPr>
-        <w:t>字段中。详见对应设计文档。</w:t>
-      </w:r>
-    </w:p>
-    <w:p>
-      <w:pPr>
         <w:pStyle w:val="3"/>
       </w:pPr>
       <w:r>
@@ -6280,7 +5677,13 @@
         <w:rPr>
           <w:rFonts w:hint="eastAsia"/>
         </w:rPr>
-        <w:t>重新计算发送的消息长度，修改消息头中的长度字段</w:t>
+        <w:t>重新计算发送的消息长度，</w:t>
+      </w:r>
+      <w:r>
+        <w:rPr>
+          <w:rFonts w:hint="eastAsia"/>
+        </w:rPr>
+        <w:t>并按老版本消息头重新生成一个消息头</w:t>
       </w:r>
     </w:p>
     <w:p>
@@ -6296,7 +5699,13 @@
         <w:rPr>
           <w:rFonts w:hint="eastAsia"/>
         </w:rPr>
-        <w:t>将消息分两段发送，先发送消息头，发送长度不包含新增字段，再跳过新增字段，发送消息体。如下图所示，消息头中，虚线部分的内容忽略。</w:t>
+        <w:t>将新的消息头和消息体使用发送接口分两次发送</w:t>
+      </w:r>
+      <w:r>
+        <w:rPr>
+          <w:rFonts w:hint="eastAsia"/>
+        </w:rPr>
+        <w:t>。</w:t>
       </w:r>
     </w:p>
     <w:p>
@@ -6307,14 +5716,15 @@
       </w:pPr>
       <w:r>
         <w:rPr>
-          <w:rFonts w:hint="eastAsia"/>
           <w:noProof/>
+          <w:sz w:val="16"/>
+          <w:szCs w:val="16"/>
         </w:rPr>
         <w:drawing>
-          <wp:inline distT="0" distB="0" distL="0" distR="0" wp14:anchorId="46969AF2" wp14:editId="1AC31334">
-            <wp:extent cx="3224150" cy="966279"/>
+          <wp:inline distT="0" distB="0" distL="0" distR="0" wp14:anchorId="19077AA3" wp14:editId="137DC217">
+            <wp:extent cx="2947916" cy="2134698"/>
             <wp:effectExtent l="0" t="0" r="0" b="0"/>
-            <wp:docPr id="8" name="图片 8"/>
+            <wp:docPr id="5" name="图片 5"/>
             <wp:cNvGraphicFramePr>
               <a:graphicFrameLocks xmlns:a="http://schemas.openxmlformats.org/drawingml/2006/main" noChangeAspect="1"/>
             </wp:cNvGraphicFramePr>
@@ -6322,11 +5732,11 @@
               <a:graphicData uri="http://schemas.openxmlformats.org/drawingml/2006/picture">
                 <pic:pic xmlns:pic="http://schemas.openxmlformats.org/drawingml/2006/picture">
                   <pic:nvPicPr>
-                    <pic:cNvPr id="8" name="msg-send-in-comp-mode.png"/>
+                    <pic:cNvPr id="5" name="msg-send.png"/>
                     <pic:cNvPicPr/>
                   </pic:nvPicPr>
                   <pic:blipFill>
-                    <a:blip r:embed="rId9">
+                    <a:blip r:embed="rId10">
                       <a:extLst>
                         <a:ext uri="{28A0092B-C50C-407E-A947-70E740481C1C}">
                           <a14:useLocalDpi xmlns:a14="http://schemas.microsoft.com/office/drawing/2010/main" val="0"/>
@@ -6340,7 +5750,7 @@
                   <pic:spPr>
                     <a:xfrm>
                       <a:off x="0" y="0"/>
-                      <a:ext cx="3279628" cy="982906"/>
+                      <a:ext cx="2968487" cy="2149594"/>
                     </a:xfrm>
                     <a:prstGeom prst="rect">
                       <a:avLst/>
@@ -6352,85 +5762,8 @@
           </wp:inline>
         </w:drawing>
       </w:r>
-    </w:p>
-    <w:p>
-      <w:pPr>
-        <w:pStyle w:val="aa"/>
-        <w:ind w:left="720" w:firstLineChars="0" w:firstLine="0"/>
-        <w:jc w:val="left"/>
-      </w:pPr>
-      <w:r>
-        <w:rPr>
-          <w:rFonts w:hint="eastAsia"/>
-        </w:rPr>
-        <w:t>在各异步会话中，发送是在各异步会话中调用相关发送接口来处理的，因此，需要在各会话中单独处理消息</w:t>
-      </w:r>
-      <w:r>
-        <w:rPr>
-          <w:rFonts w:hint="eastAsia"/>
-        </w:rPr>
-        <w:t>发送，或者在</w:t>
-      </w:r>
-      <w:r>
-        <w:rPr>
-          <w:rFonts w:hint="eastAsia"/>
-        </w:rPr>
-        <w:t xml:space="preserve"> </w:t>
-      </w:r>
-      <w:r>
-        <w:t xml:space="preserve">_netFrame </w:t>
-      </w:r>
-      <w:r>
-        <w:rPr>
-          <w:rFonts w:hint="eastAsia"/>
-        </w:rPr>
-        <w:t>及</w:t>
-      </w:r>
-      <w:r>
-        <w:rPr>
-          <w:rFonts w:hint="eastAsia"/>
-        </w:rPr>
-        <w:t xml:space="preserve"> _netRouteAgent</w:t>
-      </w:r>
-      <w:r>
-        <w:rPr>
-          <w:rFonts w:hint="eastAsia"/>
-        </w:rPr>
-        <w:t xml:space="preserve"> </w:t>
-      </w:r>
-      <w:r>
-        <w:rPr>
-          <w:rFonts w:hint="eastAsia"/>
-        </w:rPr>
-        <w:t>中提供新接口，会话中记录对端版本，在会话中根据版本调用</w:t>
-      </w:r>
-      <w:r>
-        <w:rPr>
-          <w:rFonts w:hint="eastAsia"/>
-        </w:rPr>
-        <w:t>不同的接口发送，消息转换在</w:t>
-      </w:r>
-      <w:r>
-        <w:rPr>
-          <w:rFonts w:hint="eastAsia"/>
-        </w:rPr>
-        <w:t xml:space="preserve"> </w:t>
-      </w:r>
-      <w:r>
-        <w:t xml:space="preserve">_netFrame </w:t>
-      </w:r>
-      <w:r>
-        <w:rPr>
-          <w:rFonts w:hint="eastAsia"/>
-        </w:rPr>
-        <w:t>中处理。</w:t>
-      </w:r>
-    </w:p>
-    <w:p>
-      <w:pPr>
-        <w:pStyle w:val="aa"/>
-        <w:ind w:left="720" w:firstLineChars="0" w:firstLine="0"/>
-      </w:pPr>
+      <w:bookmarkStart w:id="0" w:name="_GoBack"/>
+      <w:bookmarkEnd w:id="0"/>
     </w:p>
     <w:p>
       <w:pPr>
@@ -6574,7 +5907,7 @@
                     <pic:cNvPicPr/>
                   </pic:nvPicPr>
                   <pic:blipFill>
-                    <a:blip r:embed="rId10">
+                    <a:blip r:embed="rId11">
                       <a:extLst>
                         <a:ext uri="{28A0092B-C50C-407E-A947-70E740481C1C}">
                           <a14:useLocalDpi xmlns:a14="http://schemas.microsoft.com/office/drawing/2010/main" val="0"/>
@@ -6739,11 +6072,6 @@
     </w:p>
     <w:p/>
     <w:p>
-      <w:pPr>
-        <w:rPr>
-          <w:rFonts w:hint="eastAsia"/>
-        </w:rPr>
-      </w:pPr>
       <w:r>
         <w:rPr>
           <w:rFonts w:hint="eastAsia"/>
@@ -6870,8 +6198,6 @@
               </w:rPr>
               <w:t>0.4</w:t>
             </w:r>
-            <w:bookmarkStart w:id="0" w:name="_GoBack"/>
-            <w:bookmarkEnd w:id="0"/>
           </w:p>
         </w:tc>
         <w:tc>
@@ -6915,7 +6241,7 @@
                 <w:sz w:val="18"/>
                 <w:szCs w:val="18"/>
               </w:rPr>
-              <w:t>10</w:t>
+              <w:t>11</w:t>
             </w:r>
           </w:p>
         </w:tc>
@@ -7007,7 +6333,7 @@
                 <w:sz w:val="18"/>
                 <w:szCs w:val="18"/>
               </w:rPr>
-              <w:t>2019.1.23</w:t>
+              <w:t>2019.1.25</w:t>
             </w:r>
           </w:p>
         </w:tc>
@@ -7177,7 +6503,47 @@
                 <w:sz w:val="18"/>
                 <w:szCs w:val="18"/>
               </w:rPr>
-              <w:t>完成代码开发</w:t>
+              <w:t>完成</w:t>
+            </w:r>
+            <w:r>
+              <w:rPr>
+                <w:rFonts w:hint="eastAsia"/>
+                <w:i/>
+                <w:color w:val="8DB3E2" w:themeColor="text2" w:themeTint="66"/>
+                <w:sz w:val="18"/>
+                <w:szCs w:val="18"/>
+              </w:rPr>
+              <w:t>引擎及</w:t>
+            </w:r>
+            <w:r>
+              <w:rPr>
+                <w:rFonts w:hint="eastAsia"/>
+                <w:i/>
+                <w:color w:val="8DB3E2" w:themeColor="text2" w:themeTint="66"/>
+                <w:sz w:val="18"/>
+                <w:szCs w:val="18"/>
+              </w:rPr>
+              <w:t>C++</w:t>
+            </w:r>
+            <w:r>
+              <w:rPr>
+                <w:rFonts w:hint="eastAsia"/>
+                <w:i/>
+                <w:color w:val="8DB3E2" w:themeColor="text2" w:themeTint="66"/>
+                <w:sz w:val="18"/>
+                <w:szCs w:val="18"/>
+              </w:rPr>
+              <w:t>驱动</w:t>
+            </w:r>
+            <w:r>
+              <w:rPr>
+                <w:rFonts w:hint="eastAsia"/>
+                <w:i/>
+                <w:color w:val="8DB3E2" w:themeColor="text2" w:themeTint="66"/>
+                <w:sz w:val="18"/>
+                <w:szCs w:val="18"/>
+              </w:rPr>
+              <w:t>代码开发</w:t>
             </w:r>
           </w:p>
         </w:tc>
@@ -7245,7 +6611,17 @@
                 <w:sz w:val="18"/>
                 <w:szCs w:val="18"/>
               </w:rPr>
-              <w:t>完成自测</w:t>
+              <w:t>完成其它驱动修改及</w:t>
+            </w:r>
+            <w:r>
+              <w:rPr>
+                <w:rFonts w:hint="eastAsia"/>
+                <w:i/>
+                <w:color w:val="8DB3E2" w:themeColor="text2" w:themeTint="66"/>
+                <w:sz w:val="18"/>
+                <w:szCs w:val="18"/>
+              </w:rPr>
+              <w:t>自测</w:t>
             </w:r>
           </w:p>
         </w:tc>
@@ -11806,4 +11182,16 @@
   <a:objectDefaults/>
   <a:extraClrSchemeLst/>
 </a:theme>
+</file>
+
+<file path=customXml/item1.xml><?xml version="1.0" encoding="utf-8"?>
+<b:Sources xmlns:b="http://schemas.openxmlformats.org/officeDocument/2006/bibliography" xmlns="http://schemas.openxmlformats.org/officeDocument/2006/bibliography" SelectedStyle="\APASixthEditionOfficeOnline.xsl" StyleName="APA" Version="6"/>
+</file>
+
+<file path=customXml/itemProps1.xml><?xml version="1.0" encoding="utf-8"?>
+<ds:datastoreItem xmlns:ds="http://schemas.openxmlformats.org/officeDocument/2006/customXml" ds:itemID="{2A3C4645-5A7D-408F-B190-3C29C4C2D091}">
+  <ds:schemaRefs>
+    <ds:schemaRef ds:uri="http://schemas.openxmlformats.org/officeDocument/2006/bibliography"/>
+  </ds:schemaRefs>
+</ds:datastoreItem>
 </file>
</xml_diff>